<commit_message>
Updated Bambu Grant Submission
</commit_message>
<xml_diff>
--- a/Documentation/bambulab grant submission.docx
+++ b/Documentation/bambulab grant submission.docx
@@ -5,63 +5,441 @@
     <w:p>
       <w:pPr>
         <w:rPr>
+          <w:rFonts w:ascii="Times New Roman" w:hAnsi="Times New Roman" w:cs="Times New Roman"/>
+          <w:b/>
+          <w:bCs/>
+          <w:color w:val="1A1A1A"/>
+          <w:sz w:val="22"/>
+          <w:szCs w:val="22"/>
+          <w:shd w:val="clear" w:color="auto" w:fill="FFFFFF"/>
+        </w:rPr>
+      </w:pPr>
+      <w:r>
+        <w:rPr>
+          <w:rFonts w:ascii="Times New Roman" w:hAnsi="Times New Roman" w:cs="Times New Roman"/>
+          <w:b/>
+          <w:bCs/>
+          <w:color w:val="1A1A1A"/>
+          <w:sz w:val="22"/>
+          <w:szCs w:val="22"/>
+          <w:shd w:val="clear" w:color="auto" w:fill="FFFFFF"/>
+        </w:rPr>
+        <w:t>Tell us about your project! What inspired it, and how does it capture the maker spirit? Does it solve a real-world problem or bring a new idea to life?</w:t>
+      </w:r>
+    </w:p>
+    <w:p>
+      <w:pPr>
+        <w:rPr>
+          <w:rFonts w:ascii="Times New Roman" w:hAnsi="Times New Roman" w:cs="Times New Roman"/>
+          <w:color w:val="1A1A1A"/>
+          <w:sz w:val="22"/>
+          <w:szCs w:val="22"/>
+          <w:shd w:val="clear" w:color="auto" w:fill="FFFFFF"/>
+        </w:rPr>
+      </w:pPr>
+      <w:r>
+        <w:rPr>
+          <w:rFonts w:ascii="Times New Roman" w:hAnsi="Times New Roman" w:cs="Times New Roman"/>
+          <w:color w:val="1A1A1A"/>
+          <w:sz w:val="22"/>
+          <w:szCs w:val="22"/>
+          <w:shd w:val="clear" w:color="auto" w:fill="FFFFFF"/>
+        </w:rPr>
+        <w:t>Me and another colleague are working together to design, build, and program a quadruped robot. Both my colleague and me have dogs and very dearly love them. We also love to design and create. Then my colleague was designing an actuator, and we came up with the idea of creating a quadruped robot. I know this has been done before by larger companies like Boston Dynamics but making it accessible to others is part of our goal for this project. Creating an accessible platform for anyone to start from and build upon.</w:t>
+      </w:r>
+      <w:r>
+        <w:rPr>
+          <w:rFonts w:ascii="Times New Roman" w:hAnsi="Times New Roman" w:cs="Times New Roman"/>
+          <w:color w:val="1A1A1A"/>
+          <w:sz w:val="22"/>
+          <w:szCs w:val="22"/>
+          <w:shd w:val="clear" w:color="auto" w:fill="FFFFFF"/>
+        </w:rPr>
+        <w:br/>
+      </w:r>
+      <w:r>
+        <w:rPr>
+          <w:rFonts w:ascii="Times New Roman" w:hAnsi="Times New Roman" w:cs="Times New Roman"/>
+          <w:color w:val="1A1A1A"/>
+          <w:sz w:val="22"/>
+          <w:szCs w:val="22"/>
+          <w:shd w:val="clear" w:color="auto" w:fill="FFFFFF"/>
+        </w:rPr>
+        <w:br/>
+      </w:r>
+      <w:r>
+        <w:rPr>
           <w:rFonts w:ascii="Times New Roman" w:eastAsia="Times New Roman" w:hAnsi="Times New Roman" w:cs="Times New Roman"/>
+          <w:b/>
+          <w:bCs/>
           <w:kern w:val="0"/>
           <w:sz w:val="22"/>
           <w:szCs w:val="22"/>
           <w14:ligatures w14:val="none"/>
         </w:rPr>
+        <w:t>Please include any supporting or reference materials that illustrate your project. You may upload pictures, sketches, renders, or model files.</w:t>
+      </w:r>
+    </w:p>
+    <w:p>
+      <w:pPr>
+        <w:rPr>
+          <w:rFonts w:ascii="Times New Roman" w:hAnsi="Times New Roman" w:cs="Times New Roman"/>
+          <w:sz w:val="22"/>
+          <w:szCs w:val="22"/>
+        </w:rPr>
       </w:pPr>
       <w:r>
         <w:rPr>
           <w:rFonts w:ascii="Times New Roman" w:hAnsi="Times New Roman" w:cs="Times New Roman"/>
-          <w:color w:val="1A1A1A"/>
-          <w:sz w:val="22"/>
-          <w:szCs w:val="22"/>
-          <w:shd w:val="clear" w:color="auto" w:fill="FFFFFF"/>
-        </w:rPr>
-        <w:t>Tell us about your project! What inspired it, and how does it capture the maker spirit? Does it solve a real-world problem or bring a new idea to life?</w:t>
-      </w:r>
-      <w:r>
-        <w:rPr>
-          <w:rFonts w:ascii="Times New Roman" w:hAnsi="Times New Roman" w:cs="Times New Roman"/>
-          <w:color w:val="1A1A1A"/>
-          <w:sz w:val="22"/>
-          <w:szCs w:val="22"/>
-          <w:shd w:val="clear" w:color="auto" w:fill="FFFFFF"/>
-        </w:rPr>
-        <w:br/>
-      </w:r>
-      <w:r>
-        <w:rPr>
-          <w:rFonts w:ascii="Times New Roman" w:hAnsi="Times New Roman" w:cs="Times New Roman"/>
-          <w:color w:val="1A1A1A"/>
-          <w:sz w:val="22"/>
-          <w:szCs w:val="22"/>
-          <w:shd w:val="clear" w:color="auto" w:fill="FFFFFF"/>
-        </w:rPr>
-        <w:br/>
-      </w:r>
-      <w:r>
-        <w:rPr>
-          <w:rFonts w:ascii="Times New Roman" w:hAnsi="Times New Roman" w:cs="Times New Roman"/>
-          <w:color w:val="1A1A1A"/>
-          <w:sz w:val="22"/>
-          <w:szCs w:val="22"/>
-          <w:shd w:val="clear" w:color="auto" w:fill="FFFFFF"/>
-        </w:rPr>
-        <w:br/>
-      </w:r>
-      <w:r>
-        <w:rPr>
-          <w:rFonts w:ascii="Times New Roman" w:eastAsia="Times New Roman" w:hAnsi="Times New Roman" w:cs="Times New Roman"/>
-          <w:kern w:val="0"/>
-          <w:sz w:val="22"/>
-          <w:szCs w:val="22"/>
-          <w14:ligatures w14:val="none"/>
-        </w:rPr>
-        <w:t>Please include any supporting or reference materials that illustrate your project. You may upload pictures, sketches, renders, or model files.</w:t>
-      </w:r>
+          <w:noProof/>
+          <w:sz w:val="22"/>
+          <w:szCs w:val="22"/>
+        </w:rPr>
+        <w:drawing>
+          <wp:inline distT="0" distB="0" distL="0" distR="0" wp14:anchorId="0B67CE4C" wp14:editId="06889AD7">
+            <wp:extent cx="1719072" cy="1569756"/>
+            <wp:effectExtent l="0" t="0" r="0" b="5080"/>
+            <wp:docPr id="1218938329" name="Picture 1" descr="A black and silver circular object&#10;&#10;AI-generated content may be incorrect."/>
+            <wp:cNvGraphicFramePr>
+              <a:graphicFrameLocks xmlns:a="http://schemas.openxmlformats.org/drawingml/2006/main" noChangeAspect="1"/>
+            </wp:cNvGraphicFramePr>
+            <a:graphic xmlns:a="http://schemas.openxmlformats.org/drawingml/2006/main">
+              <a:graphicData uri="http://schemas.openxmlformats.org/drawingml/2006/picture">
+                <pic:pic xmlns:pic="http://schemas.openxmlformats.org/drawingml/2006/picture">
+                  <pic:nvPicPr>
+                    <pic:cNvPr id="1218938329" name="Picture 1" descr="A black and silver circular object&#10;&#10;AI-generated content may be incorrect."/>
+                    <pic:cNvPicPr/>
+                  </pic:nvPicPr>
+                  <pic:blipFill>
+                    <a:blip r:embed="rId4" cstate="print">
+                      <a:extLst>
+                        <a:ext uri="{28A0092B-C50C-407E-A947-70E740481C1C}">
+                          <a14:useLocalDpi xmlns:a14="http://schemas.microsoft.com/office/drawing/2010/main" val="0"/>
+                        </a:ext>
+                      </a:extLst>
+                    </a:blip>
+                    <a:stretch>
+                      <a:fillRect/>
+                    </a:stretch>
+                  </pic:blipFill>
+                  <pic:spPr>
+                    <a:xfrm>
+                      <a:off x="0" y="0"/>
+                      <a:ext cx="1788875" cy="1633496"/>
+                    </a:xfrm>
+                    <a:prstGeom prst="rect">
+                      <a:avLst/>
+                    </a:prstGeom>
+                  </pic:spPr>
+                </pic:pic>
+              </a:graphicData>
+            </a:graphic>
+          </wp:inline>
+        </w:drawing>
+      </w:r>
+      <w:r>
+        <w:rPr>
+          <w:rFonts w:ascii="Times New Roman" w:hAnsi="Times New Roman" w:cs="Times New Roman"/>
+          <w:noProof/>
+          <w:sz w:val="22"/>
+          <w:szCs w:val="22"/>
+        </w:rPr>
+        <w:drawing>
+          <wp:inline distT="0" distB="0" distL="0" distR="0" wp14:anchorId="7130B35B" wp14:editId="2BD431D6">
+            <wp:extent cx="1806854" cy="1584086"/>
+            <wp:effectExtent l="0" t="0" r="0" b="3810"/>
+            <wp:docPr id="1967598384" name="Picture 2" descr="A close-up of a machine&#10;&#10;AI-generated content may be incorrect."/>
+            <wp:cNvGraphicFramePr>
+              <a:graphicFrameLocks xmlns:a="http://schemas.openxmlformats.org/drawingml/2006/main" noChangeAspect="1"/>
+            </wp:cNvGraphicFramePr>
+            <a:graphic xmlns:a="http://schemas.openxmlformats.org/drawingml/2006/main">
+              <a:graphicData uri="http://schemas.openxmlformats.org/drawingml/2006/picture">
+                <pic:pic xmlns:pic="http://schemas.openxmlformats.org/drawingml/2006/picture">
+                  <pic:nvPicPr>
+                    <pic:cNvPr id="1967598384" name="Picture 2" descr="A close-up of a machine&#10;&#10;AI-generated content may be incorrect."/>
+                    <pic:cNvPicPr/>
+                  </pic:nvPicPr>
+                  <pic:blipFill>
+                    <a:blip r:embed="rId5" cstate="print">
+                      <a:extLst>
+                        <a:ext uri="{28A0092B-C50C-407E-A947-70E740481C1C}">
+                          <a14:useLocalDpi xmlns:a14="http://schemas.microsoft.com/office/drawing/2010/main" val="0"/>
+                        </a:ext>
+                      </a:extLst>
+                    </a:blip>
+                    <a:stretch>
+                      <a:fillRect/>
+                    </a:stretch>
+                  </pic:blipFill>
+                  <pic:spPr>
+                    <a:xfrm>
+                      <a:off x="0" y="0"/>
+                      <a:ext cx="1866936" cy="1636760"/>
+                    </a:xfrm>
+                    <a:prstGeom prst="rect">
+                      <a:avLst/>
+                    </a:prstGeom>
+                  </pic:spPr>
+                </pic:pic>
+              </a:graphicData>
+            </a:graphic>
+          </wp:inline>
+        </w:drawing>
+      </w:r>
+      <w:r>
+        <w:rPr>
+          <w:rFonts w:ascii="Times New Roman" w:hAnsi="Times New Roman" w:cs="Times New Roman"/>
+          <w:noProof/>
+          <w:sz w:val="22"/>
+          <w:szCs w:val="22"/>
+        </w:rPr>
+        <w:drawing>
+          <wp:inline distT="0" distB="0" distL="0" distR="0" wp14:anchorId="3AAC9F19" wp14:editId="1AAE4D32">
+            <wp:extent cx="1645920" cy="1597738"/>
+            <wp:effectExtent l="0" t="0" r="5080" b="2540"/>
+            <wp:docPr id="364039485" name="Picture 3"/>
+            <wp:cNvGraphicFramePr>
+              <a:graphicFrameLocks xmlns:a="http://schemas.openxmlformats.org/drawingml/2006/main" noChangeAspect="1"/>
+            </wp:cNvGraphicFramePr>
+            <a:graphic xmlns:a="http://schemas.openxmlformats.org/drawingml/2006/main">
+              <a:graphicData uri="http://schemas.openxmlformats.org/drawingml/2006/picture">
+                <pic:pic xmlns:pic="http://schemas.openxmlformats.org/drawingml/2006/picture">
+                  <pic:nvPicPr>
+                    <pic:cNvPr id="364039485" name="Picture 364039485"/>
+                    <pic:cNvPicPr/>
+                  </pic:nvPicPr>
+                  <pic:blipFill>
+                    <a:blip r:embed="rId6" cstate="print">
+                      <a:extLst>
+                        <a:ext uri="{28A0092B-C50C-407E-A947-70E740481C1C}">
+                          <a14:useLocalDpi xmlns:a14="http://schemas.microsoft.com/office/drawing/2010/main" val="0"/>
+                        </a:ext>
+                      </a:extLst>
+                    </a:blip>
+                    <a:stretch>
+                      <a:fillRect/>
+                    </a:stretch>
+                  </pic:blipFill>
+                  <pic:spPr>
+                    <a:xfrm>
+                      <a:off x="0" y="0"/>
+                      <a:ext cx="1699357" cy="1649611"/>
+                    </a:xfrm>
+                    <a:prstGeom prst="rect">
+                      <a:avLst/>
+                    </a:prstGeom>
+                  </pic:spPr>
+                </pic:pic>
+              </a:graphicData>
+            </a:graphic>
+          </wp:inline>
+        </w:drawing>
+      </w:r>
+      <w:r>
+        <w:rPr>
+          <w:rFonts w:ascii="Times New Roman" w:hAnsi="Times New Roman" w:cs="Times New Roman"/>
+          <w:noProof/>
+          <w:sz w:val="22"/>
+          <w:szCs w:val="22"/>
+        </w:rPr>
+        <w:drawing>
+          <wp:inline distT="0" distB="0" distL="0" distR="0" wp14:anchorId="235F8451" wp14:editId="3EC80681">
+            <wp:extent cx="1806854" cy="1630801"/>
+            <wp:effectExtent l="0" t="0" r="0" b="0"/>
+            <wp:docPr id="151474122" name="Picture 4" descr="A black camera on a stand&#10;&#10;AI-generated content may be incorrect."/>
+            <wp:cNvGraphicFramePr>
+              <a:graphicFrameLocks xmlns:a="http://schemas.openxmlformats.org/drawingml/2006/main" noChangeAspect="1"/>
+            </wp:cNvGraphicFramePr>
+            <a:graphic xmlns:a="http://schemas.openxmlformats.org/drawingml/2006/main">
+              <a:graphicData uri="http://schemas.openxmlformats.org/drawingml/2006/picture">
+                <pic:pic xmlns:pic="http://schemas.openxmlformats.org/drawingml/2006/picture">
+                  <pic:nvPicPr>
+                    <pic:cNvPr id="151474122" name="Picture 4" descr="A black camera on a stand&#10;&#10;AI-generated content may be incorrect."/>
+                    <pic:cNvPicPr/>
+                  </pic:nvPicPr>
+                  <pic:blipFill>
+                    <a:blip r:embed="rId7" cstate="print">
+                      <a:extLst>
+                        <a:ext uri="{28A0092B-C50C-407E-A947-70E740481C1C}">
+                          <a14:useLocalDpi xmlns:a14="http://schemas.microsoft.com/office/drawing/2010/main" val="0"/>
+                        </a:ext>
+                      </a:extLst>
+                    </a:blip>
+                    <a:stretch>
+                      <a:fillRect/>
+                    </a:stretch>
+                  </pic:blipFill>
+                  <pic:spPr>
+                    <a:xfrm>
+                      <a:off x="0" y="0"/>
+                      <a:ext cx="1842506" cy="1662979"/>
+                    </a:xfrm>
+                    <a:prstGeom prst="rect">
+                      <a:avLst/>
+                    </a:prstGeom>
+                  </pic:spPr>
+                </pic:pic>
+              </a:graphicData>
+            </a:graphic>
+          </wp:inline>
+        </w:drawing>
+      </w:r>
+      <w:r>
+        <w:rPr>
+          <w:rFonts w:ascii="Times New Roman" w:hAnsi="Times New Roman" w:cs="Times New Roman"/>
+          <w:noProof/>
+          <w:sz w:val="22"/>
+          <w:szCs w:val="22"/>
+        </w:rPr>
+        <w:drawing>
+          <wp:inline distT="0" distB="0" distL="0" distR="0" wp14:anchorId="3EAE31E3" wp14:editId="310C4536">
+            <wp:extent cx="1858061" cy="1671660"/>
+            <wp:effectExtent l="0" t="0" r="0" b="5080"/>
+            <wp:docPr id="1225917321" name="Picture 5"/>
+            <wp:cNvGraphicFramePr>
+              <a:graphicFrameLocks xmlns:a="http://schemas.openxmlformats.org/drawingml/2006/main" noChangeAspect="1"/>
+            </wp:cNvGraphicFramePr>
+            <a:graphic xmlns:a="http://schemas.openxmlformats.org/drawingml/2006/main">
+              <a:graphicData uri="http://schemas.openxmlformats.org/drawingml/2006/picture">
+                <pic:pic xmlns:pic="http://schemas.openxmlformats.org/drawingml/2006/picture">
+                  <pic:nvPicPr>
+                    <pic:cNvPr id="1225917321" name="Picture 1225917321"/>
+                    <pic:cNvPicPr/>
+                  </pic:nvPicPr>
+                  <pic:blipFill>
+                    <a:blip r:embed="rId8" cstate="print">
+                      <a:extLst>
+                        <a:ext uri="{28A0092B-C50C-407E-A947-70E740481C1C}">
+                          <a14:useLocalDpi xmlns:a14="http://schemas.microsoft.com/office/drawing/2010/main" val="0"/>
+                        </a:ext>
+                      </a:extLst>
+                    </a:blip>
+                    <a:stretch>
+                      <a:fillRect/>
+                    </a:stretch>
+                  </pic:blipFill>
+                  <pic:spPr>
+                    <a:xfrm>
+                      <a:off x="0" y="0"/>
+                      <a:ext cx="1917106" cy="1724782"/>
+                    </a:xfrm>
+                    <a:prstGeom prst="rect">
+                      <a:avLst/>
+                    </a:prstGeom>
+                  </pic:spPr>
+                </pic:pic>
+              </a:graphicData>
+            </a:graphic>
+          </wp:inline>
+        </w:drawing>
+      </w:r>
+      <w:r>
+        <w:rPr>
+          <w:rFonts w:ascii="Times New Roman" w:hAnsi="Times New Roman" w:cs="Times New Roman"/>
+          <w:noProof/>
+          <w:sz w:val="22"/>
+          <w:szCs w:val="22"/>
+        </w:rPr>
+        <w:drawing>
+          <wp:inline distT="0" distB="0" distL="0" distR="0" wp14:anchorId="181AC653" wp14:editId="792C3C25">
+            <wp:extent cx="2026310" cy="1632304"/>
+            <wp:effectExtent l="0" t="0" r="5715" b="6350"/>
+            <wp:docPr id="913278714" name="Picture 7" descr="A black mechanical device with a lever&#10;&#10;AI-generated content may be incorrect."/>
+            <wp:cNvGraphicFramePr>
+              <a:graphicFrameLocks xmlns:a="http://schemas.openxmlformats.org/drawingml/2006/main" noChangeAspect="1"/>
+            </wp:cNvGraphicFramePr>
+            <a:graphic xmlns:a="http://schemas.openxmlformats.org/drawingml/2006/main">
+              <a:graphicData uri="http://schemas.openxmlformats.org/drawingml/2006/picture">
+                <pic:pic xmlns:pic="http://schemas.openxmlformats.org/drawingml/2006/picture">
+                  <pic:nvPicPr>
+                    <pic:cNvPr id="913278714" name="Picture 7" descr="A black mechanical device with a lever&#10;&#10;AI-generated content may be incorrect."/>
+                    <pic:cNvPicPr/>
+                  </pic:nvPicPr>
+                  <pic:blipFill>
+                    <a:blip r:embed="rId9" cstate="print">
+                      <a:extLst>
+                        <a:ext uri="{28A0092B-C50C-407E-A947-70E740481C1C}">
+                          <a14:useLocalDpi xmlns:a14="http://schemas.microsoft.com/office/drawing/2010/main" val="0"/>
+                        </a:ext>
+                      </a:extLst>
+                    </a:blip>
+                    <a:stretch>
+                      <a:fillRect/>
+                    </a:stretch>
+                  </pic:blipFill>
+                  <pic:spPr>
+                    <a:xfrm>
+                      <a:off x="0" y="0"/>
+                      <a:ext cx="2104056" cy="1694933"/>
+                    </a:xfrm>
+                    <a:prstGeom prst="rect">
+                      <a:avLst/>
+                    </a:prstGeom>
+                  </pic:spPr>
+                </pic:pic>
+              </a:graphicData>
+            </a:graphic>
+          </wp:inline>
+        </w:drawing>
+      </w:r>
+      <w:r>
+        <w:rPr>
+          <w:rFonts w:ascii="Times New Roman" w:hAnsi="Times New Roman" w:cs="Times New Roman"/>
+          <w:noProof/>
+          <w:sz w:val="22"/>
+          <w:szCs w:val="22"/>
+        </w:rPr>
+        <w:drawing>
+          <wp:inline distT="0" distB="0" distL="0" distR="0" wp14:anchorId="11C15F0A" wp14:editId="5EE458B7">
+            <wp:extent cx="2040941" cy="1752026"/>
+            <wp:effectExtent l="0" t="0" r="3810" b="635"/>
+            <wp:docPr id="1363950892" name="Picture 8" descr="A black and grey robot&#10;&#10;AI-generated content may be incorrect."/>
+            <wp:cNvGraphicFramePr>
+              <a:graphicFrameLocks xmlns:a="http://schemas.openxmlformats.org/drawingml/2006/main" noChangeAspect="1"/>
+            </wp:cNvGraphicFramePr>
+            <a:graphic xmlns:a="http://schemas.openxmlformats.org/drawingml/2006/main">
+              <a:graphicData uri="http://schemas.openxmlformats.org/drawingml/2006/picture">
+                <pic:pic xmlns:pic="http://schemas.openxmlformats.org/drawingml/2006/picture">
+                  <pic:nvPicPr>
+                    <pic:cNvPr id="1363950892" name="Picture 8" descr="A black and grey robot&#10;&#10;AI-generated content may be incorrect."/>
+                    <pic:cNvPicPr/>
+                  </pic:nvPicPr>
+                  <pic:blipFill>
+                    <a:blip r:embed="rId10" cstate="print">
+                      <a:extLst>
+                        <a:ext uri="{28A0092B-C50C-407E-A947-70E740481C1C}">
+                          <a14:useLocalDpi xmlns:a14="http://schemas.microsoft.com/office/drawing/2010/main" val="0"/>
+                        </a:ext>
+                      </a:extLst>
+                    </a:blip>
+                    <a:stretch>
+                      <a:fillRect/>
+                    </a:stretch>
+                  </pic:blipFill>
+                  <pic:spPr>
+                    <a:xfrm>
+                      <a:off x="0" y="0"/>
+                      <a:ext cx="2117393" cy="1817655"/>
+                    </a:xfrm>
+                    <a:prstGeom prst="rect">
+                      <a:avLst/>
+                    </a:prstGeom>
+                  </pic:spPr>
+                </pic:pic>
+              </a:graphicData>
+            </a:graphic>
+          </wp:inline>
+        </w:drawing>
+      </w:r>
+    </w:p>
+    <w:p>
+      <w:pPr>
+        <w:rPr>
+          <w:rFonts w:ascii="Times New Roman" w:hAnsi="Times New Roman" w:cs="Times New Roman"/>
+          <w:sz w:val="22"/>
+          <w:szCs w:val="22"/>
+        </w:rPr>
+      </w:pPr>
     </w:p>
     <w:p>
       <w:pPr>
@@ -86,6 +464,8 @@
         <w:spacing w:after="0" w:line="240" w:lineRule="auto"/>
         <w:rPr>
           <w:rFonts w:ascii="Times New Roman" w:eastAsia="Times New Roman" w:hAnsi="Times New Roman" w:cs="Times New Roman"/>
+          <w:b/>
+          <w:bCs/>
           <w:kern w:val="0"/>
           <w:sz w:val="22"/>
           <w:szCs w:val="22"/>
@@ -95,11 +475,14 @@
       <w:r>
         <w:rPr>
           <w:rFonts w:ascii="Times New Roman" w:eastAsia="Times New Roman" w:hAnsi="Times New Roman" w:cs="Times New Roman"/>
+          <w:b/>
+          <w:bCs/>
           <w:kern w:val="0"/>
           <w:sz w:val="22"/>
           <w:szCs w:val="22"/>
           <w14:ligatures w14:val="none"/>
         </w:rPr>
+        <w:lastRenderedPageBreak/>
         <w:t>Describe your project roadmap. Outline where you will begin, the steps you’ll take along the way, and the technologies or tools you plan to use (e.g., 3D printing, laser cutting, etc.).</w:t>
       </w:r>
     </w:p>
@@ -111,7 +494,149 @@
           <w:kern w:val="0"/>
           <w:sz w:val="22"/>
           <w:szCs w:val="22"/>
+          <w:lang w:eastAsia="ja-JP"/>
           <w14:ligatures w14:val="none"/>
+        </w:rPr>
+      </w:pPr>
+      <w:r>
+        <w:rPr>
+          <w:rFonts w:ascii="Times New Roman" w:eastAsia="Times New Roman" w:hAnsi="Times New Roman" w:cs="Times New Roman"/>
+          <w:kern w:val="0"/>
+          <w:sz w:val="22"/>
+          <w:szCs w:val="22"/>
+          <w:lang w:eastAsia="ja-JP"/>
+          <w14:ligatures w14:val="none"/>
+        </w:rPr>
+        <w:t xml:space="preserve">We started this project focusing on the actuator design. This is the core of every joint in the quadruped. Our goal was to build something modular that we can reuse across all the legs while meeting our torque and control requirements. After having that solid starting </w:t>
+      </w:r>
+      <w:r>
+        <w:rPr>
+          <w:rFonts w:ascii="Times New Roman" w:eastAsia="Times New Roman" w:hAnsi="Times New Roman" w:cs="Times New Roman"/>
+          <w:kern w:val="0"/>
+          <w:sz w:val="22"/>
+          <w:szCs w:val="22"/>
+          <w:lang w:eastAsia="ja-JP"/>
+          <w14:ligatures w14:val="none"/>
+        </w:rPr>
+        <w:t>point,</w:t>
+      </w:r>
+      <w:r>
+        <w:rPr>
+          <w:rFonts w:ascii="Times New Roman" w:eastAsia="Times New Roman" w:hAnsi="Times New Roman" w:cs="Times New Roman"/>
+          <w:kern w:val="0"/>
+          <w:sz w:val="22"/>
+          <w:szCs w:val="22"/>
+          <w:lang w:eastAsia="ja-JP"/>
+          <w14:ligatures w14:val="none"/>
+        </w:rPr>
+        <w:t xml:space="preserve"> we moved into designing the legs themselves. The lower part of the lg we decided to use a linkage system instead of directly mounting another motor. This would help reduce the inertia in the lower leg. This will make the robot more responsive and efficient. While the leg and the body are being </w:t>
+      </w:r>
+      <w:r>
+        <w:rPr>
+          <w:rFonts w:ascii="Times New Roman" w:eastAsia="Times New Roman" w:hAnsi="Times New Roman" w:cs="Times New Roman"/>
+          <w:kern w:val="0"/>
+          <w:sz w:val="22"/>
+          <w:szCs w:val="22"/>
+          <w:lang w:eastAsia="ja-JP"/>
+          <w14:ligatures w14:val="none"/>
+        </w:rPr>
+        <w:t>designed,</w:t>
+      </w:r>
+      <w:r>
+        <w:rPr>
+          <w:rFonts w:ascii="Times New Roman" w:eastAsia="Times New Roman" w:hAnsi="Times New Roman" w:cs="Times New Roman"/>
+          <w:kern w:val="0"/>
+          <w:sz w:val="22"/>
+          <w:szCs w:val="22"/>
+          <w:lang w:eastAsia="ja-JP"/>
+          <w14:ligatures w14:val="none"/>
+        </w:rPr>
+        <w:t xml:space="preserve"> I have been working on designing a custom Field Oriented Control</w:t>
+      </w:r>
+      <w:r>
+        <w:rPr>
+          <w:rFonts w:ascii="Times New Roman" w:eastAsia="Times New Roman" w:hAnsi="Times New Roman" w:cs="Times New Roman"/>
+          <w:kern w:val="0"/>
+          <w:sz w:val="22"/>
+          <w:szCs w:val="22"/>
+          <w:lang w:eastAsia="ja-JP"/>
+          <w14:ligatures w14:val="none"/>
+        </w:rPr>
+        <w:t xml:space="preserve"> (FOC)</w:t>
+      </w:r>
+      <w:r>
+        <w:rPr>
+          <w:rFonts w:ascii="Times New Roman" w:eastAsia="Times New Roman" w:hAnsi="Times New Roman" w:cs="Times New Roman"/>
+          <w:kern w:val="0"/>
+          <w:sz w:val="22"/>
+          <w:szCs w:val="22"/>
+          <w:lang w:eastAsia="ja-JP"/>
+          <w14:ligatures w14:val="none"/>
+        </w:rPr>
+        <w:t xml:space="preserve"> board for controlling the actuators. From there the plan is to construct one leg so we can start deriving and programming the inverse kinematics and forward kinematics</w:t>
+      </w:r>
+      <w:r>
+        <w:rPr>
+          <w:rFonts w:ascii="Times New Roman" w:eastAsia="Times New Roman" w:hAnsi="Times New Roman" w:cs="Times New Roman"/>
+          <w:kern w:val="0"/>
+          <w:sz w:val="22"/>
+          <w:szCs w:val="22"/>
+          <w:lang w:eastAsia="ja-JP"/>
+          <w14:ligatures w14:val="none"/>
+        </w:rPr>
+        <w:t xml:space="preserve">. We are planning to program and control through python software. Once the leg is in a place that works </w:t>
+      </w:r>
+      <w:r>
+        <w:rPr>
+          <w:rFonts w:ascii="Times New Roman" w:eastAsia="Times New Roman" w:hAnsi="Times New Roman" w:cs="Times New Roman"/>
+          <w:kern w:val="0"/>
+          <w:sz w:val="22"/>
+          <w:szCs w:val="22"/>
+          <w:lang w:eastAsia="ja-JP"/>
+          <w14:ligatures w14:val="none"/>
+        </w:rPr>
+        <w:t>well,</w:t>
+      </w:r>
+      <w:r>
+        <w:rPr>
+          <w:rFonts w:ascii="Times New Roman" w:eastAsia="Times New Roman" w:hAnsi="Times New Roman" w:cs="Times New Roman"/>
+          <w:kern w:val="0"/>
+          <w:sz w:val="22"/>
+          <w:szCs w:val="22"/>
+          <w:lang w:eastAsia="ja-JP"/>
+          <w14:ligatures w14:val="none"/>
+        </w:rPr>
+        <w:t xml:space="preserve"> we can start constructing the other three legs and put together the quadruped. </w:t>
+      </w:r>
+      <w:r>
+        <w:rPr>
+          <w:rFonts w:ascii="Times New Roman" w:eastAsia="Times New Roman" w:hAnsi="Times New Roman" w:cs="Times New Roman"/>
+          <w:kern w:val="0"/>
+          <w:sz w:val="22"/>
+          <w:szCs w:val="22"/>
+          <w:lang w:eastAsia="ja-JP"/>
+          <w14:ligatures w14:val="none"/>
+        </w:rPr>
+        <w:t>W</w:t>
+      </w:r>
+      <w:r>
+        <w:rPr>
+          <w:rFonts w:ascii="Times New Roman" w:eastAsia="Times New Roman" w:hAnsi="Times New Roman" w:cs="Times New Roman"/>
+          <w:kern w:val="0"/>
+          <w:sz w:val="22"/>
+          <w:szCs w:val="22"/>
+          <w:lang w:eastAsia="ja-JP"/>
+          <w14:ligatures w14:val="none"/>
+        </w:rPr>
+        <w:t xml:space="preserve">e are planning to 3D print so that we can make design changes as we go. We will be using off the shelf components like bearings and bolts to hold everything together. We will be using CAD for design (SolidWorks) and FEA for force optimization (SolidWorks). </w:t>
+      </w:r>
+    </w:p>
+    <w:p>
+      <w:pPr>
+        <w:rPr>
+          <w:rFonts w:ascii="Times New Roman" w:hAnsi="Times New Roman" w:cs="Times New Roman"/>
+          <w:sz w:val="22"/>
+          <w:szCs w:val="22"/>
         </w:rPr>
       </w:pPr>
     </w:p>
@@ -119,8 +644,98 @@
       <w:pPr>
         <w:rPr>
           <w:rFonts w:ascii="Times New Roman" w:hAnsi="Times New Roman" w:cs="Times New Roman"/>
-          <w:sz w:val="22"/>
-          <w:szCs w:val="22"/>
+          <w:b/>
+          <w:bCs/>
+          <w:color w:val="1A1A1A"/>
+          <w:sz w:val="22"/>
+          <w:szCs w:val="22"/>
+          <w:shd w:val="clear" w:color="auto" w:fill="FFFFFF"/>
+        </w:rPr>
+      </w:pPr>
+      <w:r>
+        <w:rPr>
+          <w:rFonts w:ascii="Times New Roman" w:hAnsi="Times New Roman" w:cs="Times New Roman"/>
+          <w:b/>
+          <w:bCs/>
+          <w:color w:val="1A1A1A"/>
+          <w:sz w:val="22"/>
+          <w:szCs w:val="22"/>
+          <w:shd w:val="clear" w:color="auto" w:fill="FFFFFF"/>
+        </w:rPr>
+        <w:t>Describe the most difficult part of your project—whether it’s a specific component or step. How do you plan to tackle it?</w:t>
+      </w:r>
+    </w:p>
+    <w:p>
+      <w:pPr>
+        <w:rPr>
+          <w:rFonts w:ascii="Times New Roman" w:hAnsi="Times New Roman" w:cs="Times New Roman"/>
+          <w:color w:val="1A1A1A"/>
+          <w:sz w:val="22"/>
+          <w:szCs w:val="22"/>
+          <w:shd w:val="clear" w:color="auto" w:fill="FFFFFF"/>
+        </w:rPr>
+      </w:pPr>
+      <w:r>
+        <w:rPr>
+          <w:rFonts w:ascii="Times New Roman" w:hAnsi="Times New Roman" w:cs="Times New Roman"/>
+          <w:color w:val="1A1A1A"/>
+          <w:sz w:val="22"/>
+          <w:szCs w:val="22"/>
+          <w:shd w:val="clear" w:color="auto" w:fill="FFFFFF"/>
+        </w:rPr>
+        <w:t xml:space="preserve">The most difficult part of this project is going to be the custom FOC control board for the actuator control. </w:t>
+      </w:r>
+      <w:r>
+        <w:rPr>
+          <w:rFonts w:ascii="Times New Roman" w:hAnsi="Times New Roman" w:cs="Times New Roman"/>
+          <w:color w:val="1A1A1A"/>
+          <w:sz w:val="22"/>
+          <w:szCs w:val="22"/>
+          <w:shd w:val="clear" w:color="auto" w:fill="FFFFFF"/>
+        </w:rPr>
+        <w:t xml:space="preserve">This is mainly due to having little to no prior experience with PCB design. This type of board requires handling things like high current paths, noise on control lines and communication with the microcontroller. To tackle this, we broke this into smaller, manageable steps. We started with studying existing FOC designs and following proved reference schematics. Then we took it in steps starting with the schematic. We did the schematic in portions for example the gate drivers, power supply, and communication. Once each one is done then we moved into trace routing. We have an initial design and are trying to find some people that would look over it. It would be nice to have someone knowledgeable about it. We don’t really expect the first PCB to work but, once we have </w:t>
+      </w:r>
+      <w:proofErr w:type="gramStart"/>
+      <w:r>
+        <w:rPr>
+          <w:rFonts w:ascii="Times New Roman" w:hAnsi="Times New Roman" w:cs="Times New Roman"/>
+          <w:color w:val="1A1A1A"/>
+          <w:sz w:val="22"/>
+          <w:szCs w:val="22"/>
+          <w:shd w:val="clear" w:color="auto" w:fill="FFFFFF"/>
+        </w:rPr>
+        <w:t>it</w:t>
+      </w:r>
+      <w:proofErr w:type="gramEnd"/>
+      <w:r>
+        <w:rPr>
+          <w:rFonts w:ascii="Times New Roman" w:hAnsi="Times New Roman" w:cs="Times New Roman"/>
+          <w:color w:val="1A1A1A"/>
+          <w:sz w:val="22"/>
+          <w:szCs w:val="22"/>
+          <w:shd w:val="clear" w:color="auto" w:fill="FFFFFF"/>
+        </w:rPr>
+        <w:t xml:space="preserve"> we can test and figure out where we went wrong.</w:t>
+      </w:r>
+      <w:r>
+        <w:rPr>
+          <w:rFonts w:ascii="Times New Roman" w:hAnsi="Times New Roman" w:cs="Times New Roman"/>
+          <w:color w:val="1A1A1A"/>
+          <w:sz w:val="22"/>
+          <w:szCs w:val="22"/>
+          <w:shd w:val="clear" w:color="auto" w:fill="FFFFFF"/>
+        </w:rPr>
+        <w:t xml:space="preserve"> </w:t>
+      </w:r>
+    </w:p>
+    <w:p>
+      <w:pPr>
+        <w:rPr>
+          <w:rFonts w:ascii="Times New Roman" w:hAnsi="Times New Roman" w:cs="Times New Roman"/>
+          <w:color w:val="1A1A1A"/>
+          <w:sz w:val="22"/>
+          <w:szCs w:val="22"/>
+          <w:shd w:val="clear" w:color="auto" w:fill="FFFFFF"/>
         </w:rPr>
       </w:pPr>
     </w:p>
@@ -128,8 +743,145 @@
       <w:pPr>
         <w:rPr>
           <w:rFonts w:ascii="Times New Roman" w:hAnsi="Times New Roman" w:cs="Times New Roman"/>
-          <w:sz w:val="22"/>
-          <w:szCs w:val="22"/>
+          <w:b/>
+          <w:bCs/>
+          <w:color w:val="1A1A1A"/>
+          <w:sz w:val="22"/>
+          <w:szCs w:val="22"/>
+          <w:shd w:val="clear" w:color="auto" w:fill="FFFFFF"/>
+        </w:rPr>
+      </w:pPr>
+      <w:r>
+        <w:rPr>
+          <w:rFonts w:ascii="Times New Roman" w:hAnsi="Times New Roman" w:cs="Times New Roman"/>
+          <w:b/>
+          <w:bCs/>
+          <w:color w:val="1A1A1A"/>
+          <w:sz w:val="22"/>
+          <w:szCs w:val="22"/>
+          <w:shd w:val="clear" w:color="auto" w:fill="FFFFFF"/>
+        </w:rPr>
+        <w:t>Please describe the resources needed for your project, including but not limited to budget, equipment, technical support, or any other tools and materials required.</w:t>
+      </w:r>
+    </w:p>
+    <w:p>
+      <w:pPr>
+        <w:rPr>
+          <w:rFonts w:ascii="Times New Roman" w:hAnsi="Times New Roman" w:cs="Times New Roman"/>
+          <w:color w:val="1A1A1A"/>
+          <w:sz w:val="22"/>
+          <w:szCs w:val="22"/>
+          <w:shd w:val="clear" w:color="auto" w:fill="FFFFFF"/>
+        </w:rPr>
+      </w:pPr>
+      <w:r>
+        <w:rPr>
+          <w:rFonts w:ascii="Times New Roman" w:hAnsi="Times New Roman" w:cs="Times New Roman"/>
+          <w:color w:val="1A1A1A"/>
+          <w:sz w:val="22"/>
+          <w:szCs w:val="22"/>
+          <w:shd w:val="clear" w:color="auto" w:fill="FFFFFF"/>
+        </w:rPr>
+        <w:t xml:space="preserve">For our project </w:t>
+      </w:r>
+      <w:r>
+        <w:rPr>
+          <w:rFonts w:ascii="Times New Roman" w:hAnsi="Times New Roman" w:cs="Times New Roman"/>
+          <w:color w:val="1A1A1A"/>
+          <w:sz w:val="22"/>
+          <w:szCs w:val="22"/>
+          <w:shd w:val="clear" w:color="auto" w:fill="FFFFFF"/>
+        </w:rPr>
+        <w:t xml:space="preserve">access to a 3D printer would significantly improve our ability to iterate quickly during the prototyping phase. As for the actuator assemblies, each one requires numerous mechanical components. Things such as bearings, shaft collars, fasteners, threaded inserts, and nuts. There are 3 actuators per leg. Being able to rapidly design, print and refine custom parts will reduce the turnaround time and improve the system integration.  In addition to the mechanical components, we also plan to incorporate computer vision capabilities, which will require a camera and a processing board to enable real-time perception and navigation. </w:t>
+      </w:r>
+      <w:proofErr w:type="gramStart"/>
+      <w:r>
+        <w:rPr>
+          <w:rFonts w:ascii="Times New Roman" w:hAnsi="Times New Roman" w:cs="Times New Roman"/>
+          <w:color w:val="1A1A1A"/>
+          <w:sz w:val="22"/>
+          <w:szCs w:val="22"/>
+          <w:shd w:val="clear" w:color="auto" w:fill="FFFFFF"/>
+        </w:rPr>
+        <w:t>Lastly</w:t>
+      </w:r>
+      <w:proofErr w:type="gramEnd"/>
+      <w:r>
+        <w:rPr>
+          <w:rFonts w:ascii="Times New Roman" w:hAnsi="Times New Roman" w:cs="Times New Roman"/>
+          <w:color w:val="1A1A1A"/>
+          <w:sz w:val="22"/>
+          <w:szCs w:val="22"/>
+          <w:shd w:val="clear" w:color="auto" w:fill="FFFFFF"/>
+        </w:rPr>
+        <w:t xml:space="preserve"> we are designing our own custom FOC motor control board. We would require funding for the fabrication of our custom PCB’s. These boards are crucial for integrating the control algorithms and allow the quadruped to move. Finally aluminum extrusion would allow for the construction of modular test stands. Having these stands would allow for performance, efficiency, and leg kinematics testing in a safe environment prior to full system integration.</w:t>
+      </w:r>
+    </w:p>
+    <w:p>
+      <w:pPr>
+        <w:rPr>
+          <w:rFonts w:ascii="Times New Roman" w:hAnsi="Times New Roman" w:cs="Times New Roman"/>
+          <w:b/>
+          <w:bCs/>
+          <w:color w:val="1A1A1A"/>
+          <w:sz w:val="22"/>
+          <w:szCs w:val="22"/>
+          <w:shd w:val="clear" w:color="auto" w:fill="FFFFFF"/>
+        </w:rPr>
+      </w:pPr>
+      <w:r>
+        <w:rPr>
+          <w:rFonts w:ascii="Times New Roman" w:hAnsi="Times New Roman" w:cs="Times New Roman"/>
+          <w:b/>
+          <w:bCs/>
+          <w:color w:val="1A1A1A"/>
+          <w:sz w:val="22"/>
+          <w:szCs w:val="22"/>
+          <w:shd w:val="clear" w:color="auto" w:fill="FFFFFF"/>
+        </w:rPr>
+        <w:lastRenderedPageBreak/>
+        <w:t>Assuming all the resources you mentioned above are provided, please estimate how long it will take you to complete the project.</w:t>
+      </w:r>
+    </w:p>
+    <w:p>
+      <w:pPr>
+        <w:rPr>
+          <w:rFonts w:ascii="Times New Roman" w:hAnsi="Times New Roman" w:cs="Times New Roman"/>
+          <w:color w:val="1A1A1A"/>
+          <w:sz w:val="22"/>
+          <w:szCs w:val="22"/>
+          <w:shd w:val="clear" w:color="auto" w:fill="FFFFFF"/>
+        </w:rPr>
+      </w:pPr>
+      <w:r>
+        <w:rPr>
+          <w:rFonts w:ascii="Times New Roman" w:hAnsi="Times New Roman" w:cs="Times New Roman"/>
+          <w:color w:val="1A1A1A"/>
+          <w:sz w:val="22"/>
+          <w:szCs w:val="22"/>
+          <w:shd w:val="clear" w:color="auto" w:fill="FFFFFF"/>
+        </w:rPr>
+        <w:t xml:space="preserve">Me and my colleague are planning to finish it by July of this year if we get the resources needed. The PCB creation should take </w:t>
+      </w:r>
+      <w:r>
+        <w:rPr>
+          <w:rFonts w:ascii="Times New Roman" w:hAnsi="Times New Roman" w:cs="Times New Roman"/>
+          <w:color w:val="1A1A1A"/>
+          <w:sz w:val="22"/>
+          <w:szCs w:val="22"/>
+          <w:shd w:val="clear" w:color="auto" w:fill="FFFFFF"/>
+        </w:rPr>
+        <w:t>about a couple of weeks. Then the programming the rest of the design can happen concurrently. By July we should have a walking robot.</w:t>
+      </w:r>
+    </w:p>
+    <w:p>
+      <w:pPr>
+        <w:rPr>
+          <w:rFonts w:ascii="Times New Roman" w:hAnsi="Times New Roman" w:cs="Times New Roman"/>
+          <w:color w:val="1A1A1A"/>
+          <w:sz w:val="22"/>
+          <w:szCs w:val="22"/>
+          <w:shd w:val="clear" w:color="auto" w:fill="FFFFFF"/>
         </w:rPr>
       </w:pPr>
     </w:p>
@@ -137,6 +889,8 @@
       <w:pPr>
         <w:rPr>
           <w:rFonts w:ascii="Times New Roman" w:hAnsi="Times New Roman" w:cs="Times New Roman"/>
+          <w:b/>
+          <w:bCs/>
           <w:color w:val="1A1A1A"/>
           <w:sz w:val="22"/>
           <w:szCs w:val="22"/>
@@ -146,12 +900,14 @@
       <w:r>
         <w:rPr>
           <w:rFonts w:ascii="Times New Roman" w:hAnsi="Times New Roman" w:cs="Times New Roman"/>
-          <w:color w:val="1A1A1A"/>
-          <w:sz w:val="22"/>
-          <w:szCs w:val="22"/>
-          <w:shd w:val="clear" w:color="auto" w:fill="FFFFFF"/>
-        </w:rPr>
-        <w:t>Describe the most difficult part of your project—whether it’s a specific component or step. How do you plan to tackle it?</w:t>
+          <w:b/>
+          <w:bCs/>
+          <w:color w:val="1A1A1A"/>
+          <w:sz w:val="22"/>
+          <w:szCs w:val="22"/>
+          <w:shd w:val="clear" w:color="auto" w:fill="FFFFFF"/>
+        </w:rPr>
+        <w:t>We'd love to get to know you better. Tell us a little about yourself and why you believe you should be selected for the Let's Make It Fund.</w:t>
       </w:r>
     </w:p>
     <w:p>
@@ -164,135 +920,46 @@
           <w:shd w:val="clear" w:color="auto" w:fill="FFFFFF"/>
         </w:rPr>
       </w:pPr>
-    </w:p>
-    <w:p>
-      <w:pPr>
-        <w:rPr>
-          <w:rFonts w:ascii="Times New Roman" w:hAnsi="Times New Roman" w:cs="Times New Roman"/>
-          <w:color w:val="1A1A1A"/>
-          <w:sz w:val="22"/>
-          <w:szCs w:val="22"/>
-          <w:shd w:val="clear" w:color="auto" w:fill="FFFFFF"/>
-        </w:rPr>
-      </w:pPr>
-    </w:p>
-    <w:p>
-      <w:pPr>
-        <w:rPr>
-          <w:rFonts w:ascii="Times New Roman" w:hAnsi="Times New Roman" w:cs="Times New Roman"/>
-          <w:color w:val="1A1A1A"/>
-          <w:sz w:val="22"/>
-          <w:szCs w:val="22"/>
-          <w:shd w:val="clear" w:color="auto" w:fill="FFFFFF"/>
-        </w:rPr>
-      </w:pPr>
-      <w:r>
-        <w:rPr>
-          <w:rFonts w:ascii="Times New Roman" w:hAnsi="Times New Roman" w:cs="Times New Roman"/>
-          <w:color w:val="1A1A1A"/>
-          <w:sz w:val="22"/>
-          <w:szCs w:val="22"/>
-          <w:shd w:val="clear" w:color="auto" w:fill="FFFFFF"/>
-        </w:rPr>
-        <w:t>Please describe the resources needed for your project, including but not limited to budget, equipment, technical support, or any other tools and materials required.</w:t>
-      </w:r>
-    </w:p>
-    <w:p>
-      <w:pPr>
-        <w:rPr>
-          <w:rFonts w:ascii="Times New Roman" w:hAnsi="Times New Roman" w:cs="Times New Roman"/>
-          <w:color w:val="1A1A1A"/>
-          <w:sz w:val="22"/>
-          <w:szCs w:val="22"/>
-          <w:shd w:val="clear" w:color="auto" w:fill="FFFFFF"/>
-        </w:rPr>
-      </w:pPr>
-    </w:p>
-    <w:p>
-      <w:pPr>
-        <w:rPr>
-          <w:rFonts w:ascii="Times New Roman" w:hAnsi="Times New Roman" w:cs="Times New Roman"/>
-          <w:color w:val="1A1A1A"/>
-          <w:sz w:val="22"/>
-          <w:szCs w:val="22"/>
-          <w:shd w:val="clear" w:color="auto" w:fill="FFFFFF"/>
-        </w:rPr>
-      </w:pPr>
-    </w:p>
-    <w:p>
-      <w:pPr>
-        <w:rPr>
-          <w:rFonts w:ascii="Times New Roman" w:hAnsi="Times New Roman" w:cs="Times New Roman"/>
-          <w:color w:val="1A1A1A"/>
-          <w:sz w:val="22"/>
-          <w:szCs w:val="22"/>
-          <w:shd w:val="clear" w:color="auto" w:fill="FFFFFF"/>
-        </w:rPr>
-      </w:pPr>
-      <w:r>
-        <w:rPr>
-          <w:rFonts w:ascii="Times New Roman" w:hAnsi="Times New Roman" w:cs="Times New Roman"/>
-          <w:color w:val="1A1A1A"/>
-          <w:sz w:val="22"/>
-          <w:szCs w:val="22"/>
-          <w:shd w:val="clear" w:color="auto" w:fill="FFFFFF"/>
-        </w:rPr>
-        <w:t>Assuming all the resources you mentioned above are provided, please estimate how long it will take you to complete the project.</w:t>
-      </w:r>
-    </w:p>
-    <w:p>
-      <w:pPr>
-        <w:rPr>
-          <w:rFonts w:ascii="Times New Roman" w:hAnsi="Times New Roman" w:cs="Times New Roman"/>
-          <w:color w:val="1A1A1A"/>
-          <w:sz w:val="22"/>
-          <w:szCs w:val="22"/>
-          <w:shd w:val="clear" w:color="auto" w:fill="FFFFFF"/>
-        </w:rPr>
-      </w:pPr>
-    </w:p>
-    <w:p>
-      <w:pPr>
-        <w:rPr>
-          <w:rFonts w:ascii="Times New Roman" w:hAnsi="Times New Roman" w:cs="Times New Roman"/>
-          <w:color w:val="1A1A1A"/>
-          <w:sz w:val="22"/>
-          <w:szCs w:val="22"/>
-          <w:shd w:val="clear" w:color="auto" w:fill="FFFFFF"/>
-        </w:rPr>
-      </w:pPr>
-    </w:p>
-    <w:p>
-      <w:pPr>
-        <w:rPr>
-          <w:rFonts w:ascii="Times New Roman" w:hAnsi="Times New Roman" w:cs="Times New Roman"/>
-          <w:color w:val="1A1A1A"/>
-          <w:sz w:val="22"/>
-          <w:szCs w:val="22"/>
-          <w:shd w:val="clear" w:color="auto" w:fill="FFFFFF"/>
-        </w:rPr>
-      </w:pPr>
-      <w:r>
-        <w:rPr>
-          <w:rFonts w:ascii="Times New Roman" w:hAnsi="Times New Roman" w:cs="Times New Roman"/>
-          <w:color w:val="1A1A1A"/>
-          <w:sz w:val="22"/>
-          <w:szCs w:val="22"/>
-          <w:shd w:val="clear" w:color="auto" w:fill="FFFFFF"/>
-        </w:rPr>
-        <w:t>We'd love to get to know you better. Tell us a little about yourself and why you believe you should be selected for the Let's Make It Fund.</w:t>
-      </w:r>
-    </w:p>
-    <w:p>
-      <w:pPr>
-        <w:rPr>
-          <w:rFonts w:ascii="Times New Roman" w:hAnsi="Times New Roman" w:cs="Times New Roman"/>
-          <w:color w:val="1A1A1A"/>
-          <w:sz w:val="22"/>
-          <w:szCs w:val="22"/>
-          <w:shd w:val="clear" w:color="auto" w:fill="FFFFFF"/>
-        </w:rPr>
-      </w:pPr>
+      <w:r>
+        <w:rPr>
+          <w:rFonts w:ascii="Times New Roman" w:hAnsi="Times New Roman" w:cs="Times New Roman"/>
+          <w:color w:val="1A1A1A"/>
+          <w:sz w:val="22"/>
+          <w:szCs w:val="22"/>
+          <w:shd w:val="clear" w:color="auto" w:fill="FFFFFF"/>
+        </w:rPr>
+        <w:t>I am a third-year community college student</w:t>
+      </w:r>
+      <w:r>
+        <w:rPr>
+          <w:rFonts w:ascii="Times New Roman" w:hAnsi="Times New Roman" w:cs="Times New Roman"/>
+          <w:color w:val="1A1A1A"/>
+          <w:sz w:val="22"/>
+          <w:szCs w:val="22"/>
+          <w:shd w:val="clear" w:color="auto" w:fill="FFFFFF"/>
+        </w:rPr>
+        <w:t xml:space="preserve">. </w:t>
+      </w:r>
+      <w:r>
+        <w:rPr>
+          <w:rFonts w:ascii="Times New Roman" w:hAnsi="Times New Roman" w:cs="Times New Roman"/>
+          <w:color w:val="1A1A1A"/>
+          <w:sz w:val="22"/>
+          <w:szCs w:val="22"/>
+          <w:shd w:val="clear" w:color="auto" w:fill="FFFFFF"/>
+        </w:rPr>
+        <w:t xml:space="preserve">My colleague is a second-year community college student as well. I am studying mechanical engineering while also tutoring other engineering students in topics like statics, dynamics, mechanics of materials, etc. In my free time I love to get out </w:t>
+      </w:r>
+      <w:r>
+        <w:rPr>
+          <w:rFonts w:ascii="Times New Roman" w:hAnsi="Times New Roman" w:cs="Times New Roman"/>
+          <w:color w:val="1A1A1A"/>
+          <w:sz w:val="22"/>
+          <w:szCs w:val="22"/>
+          <w:shd w:val="clear" w:color="auto" w:fill="FFFFFF"/>
+        </w:rPr>
+        <w:t xml:space="preserve">try all sorts of foods and cuisines. One of my biggest hobbies outside of engineering is rock climbing! I like things that challenge me both mentally and physically. I believe that I should be selected because I consistently take on projects that go beyond the classroom and push myself to learn new skills from the ground up. This project is a good example of just that through designing the custom electronics and going through hands on iteration. I’ve shown that I’m willing to put in the time to learn difficult topics, whether that’s through tutoring others or teaching myself new systems. With the support from this fund, I’ll be able to take this project further and turn it into something fully functional. </w:t>
+      </w:r>
     </w:p>
     <w:p>
       <w:pPr>

</xml_diff>